<commit_message>
fix(comercial): remover pré-engenharia do levantamento padrão
</commit_message>
<xml_diff>
--- a/Modelos/definitivos/Comercial/modelos/Proposta Comercial.docx
+++ b/Modelos/definitivos/Comercial/modelos/Proposta Comercial.docx
@@ -94,27 +94,22 @@
               </wp:anchor>
             </w:drawing>
           </mc:Choice>
-          <mc:Fallback xmlns:pic="http://schemas.openxmlformats.org/drawingml/2006/picture">
+          <mc:Fallback>
             <w:pict>
-              <v:rect id="shape_0" stroked="f" href="https://www.filtrovali.com.br/" o:allowincell="f" style="position:absolute;margin-left:34.65pt;margin-top:-132.35pt;width:155.7pt;height:19.7pt;mso-wrap-style:square;v-text-anchor:top" wp14:anchorId="579A0571">
-                <v:fill o:detectmouseclick="t" on="false"/>
-                <v:stroke color="#3465a4" weight="9360" joinstyle="miter" endcap="flat"/>
-                <v:textbox>
+              <v:rect w14:anchorId="579A0571" id="Caixa de Texto 2" o:spid="_x0000_s1026" href="https://www.filtrovali.com.br/" style="position:absolute;left:0;text-align:left;margin-left:34.65pt;margin-top:-132.35pt;width:155.75pt;height:19.75pt;z-index:31;visibility:visible;mso-wrap-style:square;mso-height-percent:200;mso-wrap-distance-left:0;mso-wrap-distance-top:0;mso-wrap-distance-right:0;mso-wrap-distance-bottom:0;mso-position-horizontal:absolute;mso-position-horizontal-relative:text;mso-position-vertical:absolute;mso-position-vertical-relative:text;mso-height-percent:200;mso-height-relative:margin;v-text-anchor:top" o:gfxdata="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" o:button="t" filled="f" stroked="f">
+                <v:fill o:detectmouseclick="t"/>
+                <v:textbox style="mso-fit-shape-to-text:t">
                   <w:txbxContent>
                     <w:p>
                       <w:pPr>
                         <w:pStyle w:val="Contedodoquadro"/>
-                        <w:spacing w:before="0" w:after="160"/>
-                        <w:rPr/>
                       </w:pPr>
                       <w:r>
-                        <w:rPr/>
                         <w:t xml:space="preserve">                                                          </w:t>
                       </w:r>
                     </w:p>
                   </w:txbxContent>
                 </v:textbox>
-                <w10:wrap type="none"/>
               </v:rect>
             </w:pict>
           </mc:Fallback>
@@ -668,60 +663,76 @@
           <w:sz w:val="28"/>
           <w:szCs w:val="28"/>
         </w:rPr>
-      </w:pPr>
-      <w:r>
+        <w:sectPr>
+          <w:headerReference w:type="default" r:id="rId13"/>
+          <w:footerReference w:type="default" r:id="rId14"/>
+          <w:headerReference w:type="first" r:id="rId15"/>
+          <w:footerReference w:type="first" r:id="rId16"/>
+          <w:pgSz w:w="11906" w:h="16838"/>
+          <w:pgMar w:top="2977" w:right="566" w:bottom="1417" w:left="567" w:header="737" w:footer="132" w:gutter="0"/>
+          <w:cols w:space="720"/>
+          <w:formProt w:val="0"/>
+          <w:docGrid w:linePitch="299"/>
+        </w:sectPr>
+      </w:pPr>
+    </w:p>
+    <w:p>
+      <w:pPr>
+        <w:spacing w:after="0" w:line="240" w:lineRule="auto"/>
+        <w:jc w:val="center"/>
         <w:rPr>
           <w:rFonts w:ascii="Arial" w:hAnsi="Arial" w:cs="Arial"/>
           <w:b/>
           <w:sz w:val="28"/>
           <w:szCs w:val="28"/>
         </w:rPr>
+      </w:pPr>
+      <w:r>
+        <w:rPr>
+          <w:rFonts w:ascii="Arial" w:hAnsi="Arial" w:cs="Arial"/>
+          <w:b/>
+          <w:sz w:val="28"/>
+          <w:szCs w:val="28"/>
+        </w:rPr>
         <w:lastRenderedPageBreak/>
         <w:t>Proposta Comercial</w:t>
       </w:r>
-    </w:p>
-    <w:p>
-      <w:pPr>
-        <w:spacing w:after="0" w:line="240" w:lineRule="auto"/>
-        <w:rPr>
-          <w:rFonts w:ascii="Arial" w:hAnsi="Arial" w:cs="Arial"/>
+      <w:bookmarkStart w:id="0" w:name="_Hlk219204069"/>
+    </w:p>
+    <w:p>
+      <w:pPr>
+        <w:spacing w:after="0" w:line="276" w:lineRule="auto"/>
+        <w:jc w:val="center"/>
+        <w:rPr>
+          <w:rFonts w:ascii="Arial" w:hAnsi="Arial" w:cs="Arial"/>
+          <w:b/>
           <w:bCs/>
           <w:sz w:val="24"/>
           <w:szCs w:val="24"/>
         </w:rPr>
       </w:pPr>
-      <w:bookmarkStart w:id="0" w:name="_Hlk219204069"/>
-    </w:p>
-    <w:p>
-      <w:pPr>
-        <w:spacing w:after="0" w:line="240" w:lineRule="auto"/>
-        <w:rPr>
-          <w:rFonts w:ascii="Arial" w:hAnsi="Arial" w:cs="Arial"/>
-          <w:b/>
-          <w:sz w:val="20"/>
-          <w:szCs w:val="20"/>
-        </w:rPr>
-      </w:pPr>
-    </w:p>
-    <w:p>
-      <w:pPr>
-        <w:spacing w:after="0" w:line="240" w:lineRule="auto"/>
-        <w:rPr>
-          <w:rFonts w:ascii="Arial" w:hAnsi="Arial" w:cs="Arial"/>
+      <w:r>
+        <w:rPr>
+          <w:rFonts w:ascii="Arial" w:hAnsi="Arial" w:cs="Arial"/>
+          <w:b/>
           <w:bCs/>
           <w:sz w:val="24"/>
           <w:szCs w:val="24"/>
         </w:rPr>
-      </w:pPr>
-      <w:r>
-        <w:rPr>
-          <w:rFonts w:ascii="Arial" w:hAnsi="Arial" w:cs="Arial"/>
-          <w:b/>
+        <w:t xml:space="preserve"> N°: {{</w:t>
+      </w:r>
+      <w:proofErr w:type="spellStart"/>
+      <w:r>
+        <w:rPr>
+          <w:rFonts w:ascii="Arial" w:hAnsi="Arial" w:cs="Arial"/>
+          <w:b/>
+          <w:bCs/>
           <w:sz w:val="24"/>
           <w:szCs w:val="24"/>
         </w:rPr>
-        <w:t>Consultor de Vendas:</w:t>
-      </w:r>
+        <w:t>cod_prop</w:t>
+      </w:r>
+      <w:proofErr w:type="spellEnd"/>
       <w:r>
         <w:rPr>
           <w:rFonts w:ascii="Arial" w:hAnsi="Arial" w:cs="Arial"/>
@@ -730,85 +741,126 @@
           <w:sz w:val="24"/>
           <w:szCs w:val="24"/>
         </w:rPr>
-        <w:t xml:space="preserve"> {{</w:t>
+        <w:t xml:space="preserve">}} REV - </w:t>
+      </w:r>
+      <w:r>
+        <w:rPr>
+          <w:rFonts w:ascii="Arial" w:eastAsia="Arial" w:hAnsi="Arial"/>
+          <w:sz w:val="20"/>
+          <w:szCs w:val="20"/>
+        </w:rPr>
+        <w:t>{{</w:t>
       </w:r>
       <w:proofErr w:type="spellStart"/>
       <w:r>
         <w:rPr>
-          <w:rFonts w:ascii="Arial" w:hAnsi="Arial" w:cs="Arial"/>
-          <w:b/>
-          <w:bCs/>
+          <w:rFonts w:ascii="Arial" w:eastAsia="Arial" w:hAnsi="Arial"/>
+          <w:sz w:val="20"/>
+          <w:szCs w:val="20"/>
+        </w:rPr>
+        <w:t>n_rev</w:t>
+      </w:r>
+      <w:proofErr w:type="spellEnd"/>
+      <w:r>
+        <w:rPr>
+          <w:rFonts w:ascii="Arial" w:eastAsia="Arial" w:hAnsi="Arial"/>
+          <w:sz w:val="20"/>
+          <w:szCs w:val="20"/>
+        </w:rPr>
+        <w:t>}}</w:t>
+      </w:r>
+    </w:p>
+    <w:p>
+      <w:pPr>
+        <w:spacing w:after="0" w:line="240" w:lineRule="auto"/>
+        <w:jc w:val="center"/>
+        <w:rPr>
+          <w:rFonts w:ascii="Arial" w:hAnsi="Arial" w:cs="Arial"/>
+          <w:b/>
+          <w:sz w:val="28"/>
+          <w:szCs w:val="28"/>
+        </w:rPr>
+        <w:sectPr>
+          <w:type w:val="continuous"/>
+          <w:pgSz w:w="11906" w:h="16838"/>
+          <w:pgMar w:top="2977" w:right="566" w:bottom="1417" w:left="567" w:header="737" w:footer="132" w:gutter="0"/>
+          <w:cols w:num="2" w:space="720"/>
+          <w:formProt w:val="0"/>
+          <w:docGrid w:linePitch="299"/>
+        </w:sectPr>
+      </w:pPr>
+    </w:p>
+    <w:p>
+      <w:pPr>
+        <w:spacing w:after="0" w:line="240" w:lineRule="auto"/>
+        <w:jc w:val="center"/>
+        <w:rPr>
+          <w:rFonts w:ascii="Arial" w:hAnsi="Arial" w:cs="Arial"/>
+          <w:b/>
+          <w:sz w:val="28"/>
+          <w:szCs w:val="28"/>
+        </w:rPr>
+      </w:pPr>
+    </w:p>
+    <w:p>
+      <w:pPr>
+        <w:spacing w:after="0" w:line="276" w:lineRule="auto"/>
+        <w:rPr>
+          <w:rFonts w:ascii="Arial" w:hAnsi="Arial" w:cs="Arial"/>
+          <w:b/>
           <w:sz w:val="24"/>
           <w:szCs w:val="24"/>
         </w:rPr>
-        <w:t>nome_vendedor</w:t>
-      </w:r>
-      <w:proofErr w:type="spellEnd"/>
-      <w:r>
-        <w:rPr>
-          <w:rFonts w:ascii="Arial" w:hAnsi="Arial" w:cs="Arial"/>
-          <w:b/>
-          <w:bCs/>
+        <w:sectPr>
+          <w:type w:val="continuous"/>
+          <w:pgSz w:w="11906" w:h="16838"/>
+          <w:pgMar w:top="2977" w:right="566" w:bottom="1417" w:left="567" w:header="737" w:footer="132" w:gutter="0"/>
+          <w:cols w:space="720"/>
+          <w:formProt w:val="0"/>
+          <w:docGrid w:linePitch="299"/>
+        </w:sectPr>
+      </w:pPr>
+    </w:p>
+    <w:p>
+      <w:pPr>
+        <w:spacing w:after="0" w:line="276" w:lineRule="auto"/>
+        <w:rPr>
+          <w:rFonts w:ascii="Arial" w:hAnsi="Arial" w:cs="Arial"/>
+          <w:b/>
           <w:sz w:val="24"/>
           <w:szCs w:val="24"/>
         </w:rPr>
-        <w:t>}}</w:t>
-      </w:r>
-    </w:p>
-    <w:p>
-      <w:pPr>
-        <w:spacing w:after="0" w:line="240" w:lineRule="auto"/>
-        <w:rPr>
-          <w:rFonts w:ascii="Arial" w:hAnsi="Arial" w:cs="Arial"/>
-          <w:b/>
-          <w:sz w:val="20"/>
-          <w:szCs w:val="20"/>
-        </w:rPr>
-      </w:pPr>
-      <w:r>
-        <w:rPr>
-          <w:rFonts w:ascii="Arial" w:hAnsi="Arial" w:cs="Arial"/>
-          <w:bCs/>
+      </w:pPr>
+      <w:r>
+        <w:rPr>
+          <w:rFonts w:ascii="Arial" w:hAnsi="Arial" w:cs="Arial"/>
+          <w:b/>
           <w:sz w:val="24"/>
           <w:szCs w:val="24"/>
         </w:rPr>
-        <w:t>Orçamentista: {{</w:t>
-      </w:r>
-      <w:proofErr w:type="spellStart"/>
-      <w:r>
+        <w:t>DADOS INTERNOS</w:t>
+      </w:r>
+    </w:p>
+    <w:p>
+      <w:pPr>
+        <w:spacing w:after="0" w:line="276" w:lineRule="auto"/>
         <w:rPr>
           <w:rFonts w:ascii="Arial" w:hAnsi="Arial" w:cs="Arial"/>
           <w:bCs/>
           <w:sz w:val="24"/>
           <w:szCs w:val="24"/>
         </w:rPr>
-        <w:t>elaborador_proposta</w:t>
-      </w:r>
-      <w:proofErr w:type="spellEnd"/>
-      <w:r>
-        <w:rPr>
-          <w:rFonts w:ascii="Arial" w:hAnsi="Arial" w:cs="Arial"/>
-          <w:bCs/>
+      </w:pPr>
+      <w:r>
+        <w:rPr>
+          <w:rFonts w:ascii="Arial" w:hAnsi="Arial" w:cs="Arial"/>
+          <w:b/>
           <w:sz w:val="24"/>
           <w:szCs w:val="24"/>
         </w:rPr>
-        <w:t>}}</w:t>
-      </w:r>
-    </w:p>
-    <w:p>
-      <w:pPr>
-        <w:spacing w:after="0" w:line="240" w:lineRule="auto"/>
-        <w:rPr>
-          <w:rFonts w:ascii="Arial" w:hAnsi="Arial" w:cs="Arial"/>
-          <w:b/>
-          <w:sz w:val="20"/>
-          <w:szCs w:val="20"/>
-        </w:rPr>
-      </w:pPr>
-    </w:p>
-    <w:p>
-      <w:pPr>
-        <w:spacing w:after="0" w:line="240" w:lineRule="auto"/>
+        <w:t>Consultor de Vendas:</w:t>
+      </w:r>
+      <w:r>
         <w:rPr>
           <w:rFonts w:ascii="Arial" w:hAnsi="Arial" w:cs="Arial"/>
           <w:b/>
@@ -816,7 +868,9 @@
           <w:sz w:val="24"/>
           <w:szCs w:val="24"/>
         </w:rPr>
-      </w:pPr>
+        <w:t xml:space="preserve"> {{</w:t>
+      </w:r>
+      <w:proofErr w:type="spellStart"/>
       <w:r>
         <w:rPr>
           <w:rFonts w:ascii="Arial" w:hAnsi="Arial" w:cs="Arial"/>
@@ -825,9 +879,9 @@
           <w:sz w:val="24"/>
           <w:szCs w:val="24"/>
         </w:rPr>
-        <w:t>PROPOSTA N°: {{</w:t>
-      </w:r>
-      <w:proofErr w:type="spellStart"/>
+        <w:t>nome_vendedor</w:t>
+      </w:r>
+      <w:proofErr w:type="spellEnd"/>
       <w:r>
         <w:rPr>
           <w:rFonts w:ascii="Arial" w:hAnsi="Arial" w:cs="Arial"/>
@@ -836,178 +890,310 @@
           <w:sz w:val="24"/>
           <w:szCs w:val="24"/>
         </w:rPr>
-        <w:t>cod_prop</w:t>
-      </w:r>
-      <w:proofErr w:type="spellEnd"/>
-      <w:r>
-        <w:rPr>
-          <w:rFonts w:ascii="Arial" w:hAnsi="Arial" w:cs="Arial"/>
-          <w:b/>
-          <w:bCs/>
+        <w:t>}}</w:t>
+      </w:r>
+    </w:p>
+    <w:p>
+      <w:pPr>
+        <w:spacing w:after="0" w:line="276" w:lineRule="auto"/>
+        <w:rPr>
+          <w:rFonts w:ascii="Arial" w:hAnsi="Arial" w:cs="Arial"/>
+          <w:b/>
+          <w:sz w:val="20"/>
+          <w:szCs w:val="20"/>
+        </w:rPr>
+      </w:pPr>
+      <w:r>
+        <w:rPr>
+          <w:rFonts w:ascii="Arial" w:hAnsi="Arial" w:cs="Arial"/>
+          <w:b/>
           <w:sz w:val="24"/>
           <w:szCs w:val="24"/>
         </w:rPr>
-        <w:t xml:space="preserve">}} REV - </w:t>
-      </w:r>
-      <w:r>
-        <w:rPr>
-          <w:rFonts w:ascii="Arial" w:eastAsia="Arial" w:hAnsi="Arial"/>
-          <w:sz w:val="20"/>
-          <w:szCs w:val="20"/>
-        </w:rPr>
-        <w:t>{{</w:t>
-      </w:r>
-      <w:proofErr w:type="spellStart"/>
-      <w:r>
-        <w:rPr>
-          <w:rFonts w:ascii="Arial" w:eastAsia="Arial" w:hAnsi="Arial"/>
-          <w:sz w:val="20"/>
-          <w:szCs w:val="20"/>
-        </w:rPr>
-        <w:t>n_rev</w:t>
-      </w:r>
-      <w:proofErr w:type="spellEnd"/>
-      <w:r>
-        <w:rPr>
-          <w:rFonts w:ascii="Arial" w:eastAsia="Arial" w:hAnsi="Arial"/>
-          <w:sz w:val="20"/>
-          <w:szCs w:val="20"/>
-        </w:rPr>
-        <w:t>}}</w:t>
-      </w:r>
-    </w:p>
-    <w:p>
-      <w:pPr>
-        <w:spacing w:after="0" w:line="240" w:lineRule="auto"/>
-        <w:rPr>
-          <w:rFonts w:ascii="Arial" w:hAnsi="Arial" w:cs="Arial"/>
-          <w:b/>
+        <w:t>Orçamentista:</w:t>
+      </w:r>
+      <w:r>
+        <w:rPr>
+          <w:rFonts w:ascii="Arial" w:hAnsi="Arial" w:cs="Arial"/>
           <w:bCs/>
           <w:sz w:val="24"/>
           <w:szCs w:val="24"/>
         </w:rPr>
-      </w:pPr>
-      <w:r>
-        <w:rPr>
-          <w:rFonts w:ascii="Arial" w:hAnsi="Arial" w:cs="Arial"/>
-          <w:b/>
+        <w:t xml:space="preserve"> {{</w:t>
+      </w:r>
+      <w:proofErr w:type="spellStart"/>
+      <w:r>
+        <w:rPr>
+          <w:rFonts w:ascii="Arial" w:hAnsi="Arial" w:cs="Arial"/>
           <w:bCs/>
           <w:sz w:val="24"/>
           <w:szCs w:val="24"/>
         </w:rPr>
-        <w:t>CLIENTE: {{</w:t>
-      </w:r>
-      <w:proofErr w:type="spellStart"/>
-      <w:r>
-        <w:rPr>
-          <w:rFonts w:ascii="Arial" w:hAnsi="Arial" w:cs="Arial"/>
-          <w:b/>
+        <w:t>elaborador_proposta</w:t>
+      </w:r>
+      <w:proofErr w:type="spellEnd"/>
+      <w:r>
+        <w:rPr>
+          <w:rFonts w:ascii="Arial" w:hAnsi="Arial" w:cs="Arial"/>
           <w:bCs/>
           <w:sz w:val="24"/>
           <w:szCs w:val="24"/>
         </w:rPr>
-        <w:t>nome_cliente</w:t>
-      </w:r>
-      <w:proofErr w:type="spellEnd"/>
-      <w:r>
-        <w:rPr>
-          <w:rFonts w:ascii="Arial" w:hAnsi="Arial" w:cs="Arial"/>
-          <w:b/>
-          <w:bCs/>
+        <w:t>}}</w:t>
+      </w:r>
+    </w:p>
+    <w:p>
+      <w:pPr>
+        <w:spacing w:after="0" w:line="276" w:lineRule="auto"/>
+        <w:rPr>
+          <w:rFonts w:ascii="Arial" w:hAnsi="Arial" w:cs="Arial"/>
+          <w:b/>
+          <w:sz w:val="20"/>
+          <w:szCs w:val="20"/>
+        </w:rPr>
+      </w:pPr>
+    </w:p>
+    <w:p>
+      <w:pPr>
+        <w:spacing w:after="0" w:line="276" w:lineRule="auto"/>
+        <w:rPr>
+          <w:rFonts w:ascii="Arial" w:hAnsi="Arial" w:cs="Arial"/>
+          <w:b/>
+          <w:sz w:val="20"/>
+          <w:szCs w:val="20"/>
+        </w:rPr>
+      </w:pPr>
+    </w:p>
+    <w:p>
+      <w:pPr>
+        <w:spacing w:after="0" w:line="276" w:lineRule="auto"/>
+        <w:rPr>
+          <w:rFonts w:ascii="Arial" w:hAnsi="Arial" w:cs="Arial"/>
           <w:sz w:val="24"/>
           <w:szCs w:val="24"/>
         </w:rPr>
-        <w:t>}}</w:t>
-      </w:r>
-    </w:p>
-    <w:p>
-      <w:pPr>
-        <w:spacing w:after="0" w:line="240" w:lineRule="auto"/>
-        <w:rPr>
-          <w:rFonts w:ascii="Arial" w:hAnsi="Arial" w:cs="Arial"/>
+      </w:pPr>
+    </w:p>
+    <w:p>
+      <w:pPr>
+        <w:spacing w:after="0" w:line="276" w:lineRule="auto"/>
+        <w:rPr>
+          <w:rFonts w:ascii="Arial" w:hAnsi="Arial" w:cs="Arial"/>
+          <w:b/>
+          <w:bCs/>
           <w:sz w:val="24"/>
           <w:szCs w:val="24"/>
         </w:rPr>
       </w:pPr>
-      <w:r>
-        <w:rPr>
-          <w:rFonts w:ascii="Arial" w:hAnsi="Arial" w:cs="Arial"/>
+    </w:p>
+    <w:p>
+      <w:pPr>
+        <w:spacing w:after="0" w:line="276" w:lineRule="auto"/>
+        <w:rPr>
+          <w:rFonts w:ascii="Arial" w:hAnsi="Arial" w:cs="Arial"/>
+          <w:b/>
+          <w:bCs/>
           <w:sz w:val="24"/>
           <w:szCs w:val="24"/>
         </w:rPr>
-        <w:t>A/C: {{</w:t>
-      </w:r>
-      <w:proofErr w:type="spellStart"/>
-      <w:r>
-        <w:rPr>
-          <w:rFonts w:ascii="Arial" w:hAnsi="Arial" w:cs="Arial"/>
+      </w:pPr>
+    </w:p>
+    <w:p>
+      <w:pPr>
+        <w:spacing w:after="0" w:line="276" w:lineRule="auto"/>
+        <w:rPr>
+          <w:rFonts w:ascii="Arial" w:hAnsi="Arial" w:cs="Arial"/>
+          <w:b/>
+          <w:bCs/>
           <w:sz w:val="24"/>
           <w:szCs w:val="24"/>
         </w:rPr>
-        <w:t>contato_cliente</w:t>
-      </w:r>
-      <w:proofErr w:type="spellEnd"/>
-      <w:r>
-        <w:rPr>
-          <w:rFonts w:ascii="Arial" w:hAnsi="Arial" w:cs="Arial"/>
+      </w:pPr>
+    </w:p>
+    <w:p>
+      <w:pPr>
+        <w:spacing w:after="0" w:line="276" w:lineRule="auto"/>
+        <w:rPr>
+          <w:rFonts w:ascii="Arial" w:hAnsi="Arial" w:cs="Arial"/>
+          <w:b/>
+          <w:bCs/>
           <w:sz w:val="24"/>
           <w:szCs w:val="24"/>
         </w:rPr>
-        <w:t>}}</w:t>
-      </w:r>
-    </w:p>
-    <w:p>
-      <w:pPr>
-        <w:spacing w:after="0" w:line="240" w:lineRule="auto"/>
-        <w:rPr>
-          <w:rFonts w:ascii="Arial" w:hAnsi="Arial" w:cs="Arial"/>
+      </w:pPr>
+      <w:r>
+        <w:rPr>
+          <w:rFonts w:ascii="Arial" w:hAnsi="Arial" w:cs="Arial"/>
+          <w:b/>
+          <w:bCs/>
           <w:sz w:val="24"/>
           <w:szCs w:val="24"/>
         </w:rPr>
-      </w:pPr>
-      <w:r>
-        <w:rPr>
-          <w:rFonts w:ascii="Arial" w:hAnsi="Arial" w:cs="Arial"/>
+        <w:t>DADOS DO CLIENTE</w:t>
+      </w:r>
+    </w:p>
+    <w:p>
+      <w:pPr>
+        <w:spacing w:after="0" w:line="276" w:lineRule="auto"/>
+        <w:rPr>
+          <w:rFonts w:ascii="Arial" w:hAnsi="Arial" w:cs="Arial"/>
+          <w:b/>
+          <w:bCs/>
           <w:sz w:val="24"/>
           <w:szCs w:val="24"/>
         </w:rPr>
-        <w:t>E-mail do solicitante: {{</w:t>
-      </w:r>
-      <w:proofErr w:type="spellStart"/>
-      <w:r>
-        <w:rPr>
-          <w:rFonts w:ascii="Arial" w:hAnsi="Arial" w:cs="Arial"/>
+      </w:pPr>
+      <w:r>
+        <w:rPr>
+          <w:rFonts w:ascii="Arial" w:hAnsi="Arial" w:cs="Arial"/>
+          <w:b/>
+          <w:bCs/>
           <w:sz w:val="24"/>
           <w:szCs w:val="24"/>
         </w:rPr>
-        <w:t>email_cliente</w:t>
-      </w:r>
-      <w:proofErr w:type="spellEnd"/>
-      <w:r>
-        <w:rPr>
-          <w:rFonts w:ascii="Arial" w:hAnsi="Arial" w:cs="Arial"/>
+        <w:t>{{</w:t>
+      </w:r>
+      <w:proofErr w:type="spellStart"/>
+      <w:r>
+        <w:rPr>
+          <w:rFonts w:ascii="Arial" w:hAnsi="Arial" w:cs="Arial"/>
+          <w:b/>
+          <w:bCs/>
           <w:sz w:val="24"/>
           <w:szCs w:val="24"/>
         </w:rPr>
-        <w:t>}}</w:t>
-      </w:r>
-    </w:p>
-    <w:p>
-      <w:pPr>
-        <w:spacing w:after="0" w:line="240" w:lineRule="auto"/>
-        <w:rPr>
-          <w:rFonts w:ascii="Arial" w:hAnsi="Arial" w:cs="Arial"/>
+        <w:t>nome_cliente</w:t>
+      </w:r>
+      <w:proofErr w:type="spellEnd"/>
+      <w:r>
+        <w:rPr>
+          <w:rFonts w:ascii="Arial" w:hAnsi="Arial" w:cs="Arial"/>
+          <w:b/>
+          <w:bCs/>
           <w:sz w:val="24"/>
           <w:szCs w:val="24"/>
         </w:rPr>
-      </w:pPr>
-      <w:r>
+        <w:t>}}</w:t>
+      </w:r>
+    </w:p>
+    <w:p>
+      <w:pPr>
+        <w:spacing w:after="0" w:line="276" w:lineRule="auto"/>
         <w:rPr>
           <w:rFonts w:ascii="Arial" w:hAnsi="Arial" w:cs="Arial"/>
           <w:sz w:val="24"/>
           <w:szCs w:val="24"/>
         </w:rPr>
-        <w:t>Departamento: {{</w:t>
+      </w:pPr>
+      <w:r>
+        <w:rPr>
+          <w:rFonts w:ascii="Arial" w:hAnsi="Arial" w:cs="Arial"/>
+          <w:b/>
+          <w:bCs/>
+          <w:sz w:val="24"/>
+          <w:szCs w:val="24"/>
+        </w:rPr>
+        <w:t xml:space="preserve">A/C </w:t>
+      </w:r>
+      <w:r>
+        <w:rPr>
+          <w:rFonts w:ascii="Arial" w:hAnsi="Arial" w:cs="Arial"/>
+          <w:sz w:val="24"/>
+          <w:szCs w:val="24"/>
+        </w:rPr>
+        <w:t>{{</w:t>
+      </w:r>
+      <w:proofErr w:type="spellStart"/>
+      <w:r>
+        <w:rPr>
+          <w:rFonts w:ascii="Arial" w:hAnsi="Arial" w:cs="Arial"/>
+          <w:sz w:val="24"/>
+          <w:szCs w:val="24"/>
+        </w:rPr>
+        <w:t>contato_cliente</w:t>
+      </w:r>
+      <w:proofErr w:type="spellEnd"/>
+      <w:r>
+        <w:rPr>
+          <w:rFonts w:ascii="Arial" w:hAnsi="Arial" w:cs="Arial"/>
+          <w:sz w:val="24"/>
+          <w:szCs w:val="24"/>
+        </w:rPr>
+        <w:t>}}</w:t>
+      </w:r>
+    </w:p>
+    <w:p>
+      <w:pPr>
+        <w:spacing w:after="0" w:line="276" w:lineRule="auto"/>
+        <w:rPr>
+          <w:rFonts w:ascii="Arial" w:hAnsi="Arial" w:cs="Arial"/>
+          <w:sz w:val="24"/>
+          <w:szCs w:val="24"/>
+        </w:rPr>
+      </w:pPr>
+      <w:r>
+        <w:rPr>
+          <w:rFonts w:ascii="Arial" w:hAnsi="Arial" w:cs="Arial"/>
+          <w:b/>
+          <w:bCs/>
+          <w:sz w:val="24"/>
+          <w:szCs w:val="24"/>
+        </w:rPr>
+        <w:t>E-mail do solicitante:</w:t>
+      </w:r>
+      <w:r>
+        <w:rPr>
+          <w:rFonts w:ascii="Arial" w:hAnsi="Arial" w:cs="Arial"/>
+          <w:sz w:val="24"/>
+          <w:szCs w:val="24"/>
+        </w:rPr>
+        <w:t xml:space="preserve"> {{</w:t>
+      </w:r>
+      <w:proofErr w:type="spellStart"/>
+      <w:r>
+        <w:rPr>
+          <w:rFonts w:ascii="Arial" w:hAnsi="Arial" w:cs="Arial"/>
+          <w:sz w:val="24"/>
+          <w:szCs w:val="24"/>
+        </w:rPr>
+        <w:t>email_cliente</w:t>
+      </w:r>
+      <w:proofErr w:type="spellEnd"/>
+      <w:r>
+        <w:rPr>
+          <w:rFonts w:ascii="Arial" w:hAnsi="Arial" w:cs="Arial"/>
+          <w:sz w:val="24"/>
+          <w:szCs w:val="24"/>
+        </w:rPr>
+        <w:t>}}</w:t>
+      </w:r>
+    </w:p>
+    <w:p>
+      <w:pPr>
+        <w:spacing w:after="0" w:line="276" w:lineRule="auto"/>
+        <w:rPr>
+          <w:rFonts w:ascii="Arial" w:hAnsi="Arial" w:cs="Arial"/>
+          <w:sz w:val="24"/>
+          <w:szCs w:val="24"/>
+        </w:rPr>
+      </w:pPr>
+      <w:r>
+        <w:rPr>
+          <w:rFonts w:ascii="Arial" w:hAnsi="Arial" w:cs="Arial"/>
+          <w:b/>
+          <w:bCs/>
+          <w:sz w:val="24"/>
+          <w:szCs w:val="24"/>
+        </w:rPr>
+        <w:t>Departamento:</w:t>
+      </w:r>
+      <w:r>
+        <w:rPr>
+          <w:rFonts w:ascii="Arial" w:hAnsi="Arial" w:cs="Arial"/>
+          <w:sz w:val="24"/>
+          <w:szCs w:val="24"/>
+        </w:rPr>
+        <w:t xml:space="preserve"> {{</w:t>
       </w:r>
       <w:proofErr w:type="spellStart"/>
       <w:r>
@@ -1033,7 +1219,7 @@
         <w:tabs>
           <w:tab w:val="left" w:pos="9945"/>
         </w:tabs>
-        <w:spacing w:after="0" w:line="240" w:lineRule="auto"/>
+        <w:spacing w:after="0" w:line="276" w:lineRule="auto"/>
         <w:rPr>
           <w:rFonts w:ascii="Arial" w:hAnsi="Arial" w:cs="Arial"/>
           <w:sz w:val="24"/>
@@ -1051,7 +1237,7 @@
     </w:p>
     <w:p>
       <w:pPr>
-        <w:spacing w:after="0" w:line="240" w:lineRule="auto"/>
+        <w:spacing w:after="0" w:line="276" w:lineRule="auto"/>
         <w:rPr>
           <w:rFonts w:ascii="Arial" w:hAnsi="Arial" w:cs="Arial"/>
           <w:sz w:val="24"/>
@@ -1097,7 +1283,7 @@
     </w:p>
     <w:p>
       <w:pPr>
-        <w:spacing w:after="0" w:line="240" w:lineRule="auto"/>
+        <w:spacing w:after="0" w:line="276" w:lineRule="auto"/>
         <w:rPr>
           <w:rFonts w:ascii="Arial" w:hAnsi="Arial" w:cs="Arial"/>
           <w:b/>
@@ -1109,7 +1295,7 @@
     </w:p>
     <w:p>
       <w:pPr>
-        <w:spacing w:after="0" w:line="240" w:lineRule="auto"/>
+        <w:spacing w:after="0" w:line="276" w:lineRule="auto"/>
         <w:rPr>
           <w:rFonts w:ascii="Arial" w:hAnsi="Arial" w:cs="Arial"/>
           <w:b/>
@@ -1155,6 +1341,26 @@
         <w:t>}}</w:t>
       </w:r>
       <w:bookmarkEnd w:id="0"/>
+    </w:p>
+    <w:p>
+      <w:pPr>
+        <w:spacing w:after="0" w:line="240" w:lineRule="auto"/>
+        <w:jc w:val="center"/>
+        <w:rPr>
+          <w:rFonts w:ascii="Arial" w:hAnsi="Arial" w:cs="Arial"/>
+          <w:b/>
+          <w:sz w:val="20"/>
+          <w:szCs w:val="20"/>
+        </w:rPr>
+        <w:sectPr>
+          <w:type w:val="continuous"/>
+          <w:pgSz w:w="11906" w:h="16838"/>
+          <w:pgMar w:top="2977" w:right="566" w:bottom="1417" w:left="567" w:header="737" w:footer="132" w:gutter="0"/>
+          <w:cols w:num="2" w:space="720"/>
+          <w:formProt w:val="0"/>
+          <w:docGrid w:linePitch="299"/>
+        </w:sectPr>
+      </w:pPr>
     </w:p>
     <w:p>
       <w:pPr>
@@ -1952,17 +2158,15 @@
               </wp:anchor>
             </w:drawing>
           </mc:Choice>
-          <mc:Fallback xmlns:pic="http://schemas.openxmlformats.org/drawingml/2006/picture">
+          <mc:Fallback>
             <w:pict>
-              <v:rect id="shape_0" stroked="f" o:allowincell="f" style="position:absolute;margin-left:117.45pt;margin-top:87.95pt;width:102.55pt;height:54.55pt;mso-wrap-style:square;v-text-anchor:top" wp14:anchorId="5B195204">
-                <v:fill o:detectmouseclick="t" on="false"/>
-                <v:stroke color="#3465a4" weight="9360" joinstyle="miter" endcap="flat"/>
+              <v:rect w14:anchorId="5B195204" id="_x0000_s1027" style="position:absolute;left:0;text-align:left;margin-left:117.45pt;margin-top:87.95pt;width:102.6pt;height:54.6pt;z-index:-503316458;visibility:visible;mso-wrap-style:square;mso-wrap-distance-left:0;mso-wrap-distance-top:0;mso-wrap-distance-right:0;mso-wrap-distance-bottom:0;mso-position-horizontal:absolute;mso-position-horizontal-relative:text;mso-position-vertical:absolute;mso-position-vertical-relative:text;v-text-anchor:top" o:gfxdata="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" filled="f" stroked="f">
                 <v:textbox>
                   <w:txbxContent>
                     <w:p>
                       <w:pPr>
                         <w:pStyle w:val="Contedodoquadro"/>
-                        <w:spacing w:lineRule="auto" w:line="240" w:before="0" w:after="160"/>
+                        <w:spacing w:line="240" w:lineRule="auto"/>
                         <w:jc w:val="center"/>
                         <w:rPr>
                           <w:b/>
@@ -1979,7 +2183,6 @@
                     </w:p>
                   </w:txbxContent>
                 </v:textbox>
-                <w10:wrap type="none"/>
               </v:rect>
             </w:pict>
           </mc:Fallback>
@@ -2065,17 +2268,15 @@
               </wp:anchor>
             </w:drawing>
           </mc:Choice>
-          <mc:Fallback xmlns:pic="http://schemas.openxmlformats.org/drawingml/2006/picture">
+          <mc:Fallback>
             <w:pict>
-              <v:rect id="shape_0" stroked="f" o:allowincell="f" style="position:absolute;margin-left:223.05pt;margin-top:87.95pt;width:102.55pt;height:54.55pt;mso-wrap-style:square;v-text-anchor:top" wp14:anchorId="37E06C74">
-                <v:fill o:detectmouseclick="t" on="false"/>
-                <v:stroke color="#3465a4" weight="9360" joinstyle="miter" endcap="flat"/>
+              <v:rect w14:anchorId="37E06C74" id="_x0000_s1028" style="position:absolute;left:0;text-align:left;margin-left:223.05pt;margin-top:87.95pt;width:102.6pt;height:54.6pt;z-index:-503316456;visibility:visible;mso-wrap-style:square;mso-wrap-distance-left:0;mso-wrap-distance-top:0;mso-wrap-distance-right:0;mso-wrap-distance-bottom:0;mso-position-horizontal:absolute;mso-position-horizontal-relative:text;mso-position-vertical:absolute;mso-position-vertical-relative:text;v-text-anchor:top" o:gfxdata="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" filled="f" stroked="f">
                 <v:textbox>
                   <w:txbxContent>
                     <w:p>
                       <w:pPr>
                         <w:pStyle w:val="Contedodoquadro"/>
-                        <w:spacing w:lineRule="auto" w:line="240" w:before="0" w:after="160"/>
+                        <w:spacing w:line="240" w:lineRule="auto"/>
                         <w:jc w:val="center"/>
                         <w:rPr>
                           <w:b/>
@@ -2092,7 +2293,6 @@
                     </w:p>
                   </w:txbxContent>
                 </v:textbox>
-                <w10:wrap type="none"/>
               </v:rect>
             </w:pict>
           </mc:Fallback>
@@ -2194,17 +2394,15 @@
               </wp:anchor>
             </w:drawing>
           </mc:Choice>
-          <mc:Fallback xmlns:pic="http://schemas.openxmlformats.org/drawingml/2006/picture">
+          <mc:Fallback>
             <w:pict>
-              <v:rect id="shape_0" stroked="f" o:allowincell="f" style="position:absolute;margin-left:317.25pt;margin-top:87.95pt;width:102.55pt;height:54.55pt;mso-wrap-style:square;v-text-anchor:top" wp14:anchorId="394AE519">
-                <v:fill o:detectmouseclick="t" on="false"/>
-                <v:stroke color="#3465a4" weight="9360" joinstyle="miter" endcap="flat"/>
+              <v:rect w14:anchorId="394AE519" id="_x0000_s1029" style="position:absolute;left:0;text-align:left;margin-left:317.25pt;margin-top:87.95pt;width:102.6pt;height:54.6pt;z-index:-503316454;visibility:visible;mso-wrap-style:square;mso-wrap-distance-left:0;mso-wrap-distance-top:0;mso-wrap-distance-right:0;mso-wrap-distance-bottom:0;mso-position-horizontal:absolute;mso-position-horizontal-relative:text;mso-position-vertical:absolute;mso-position-vertical-relative:text;v-text-anchor:top" o:gfxdata="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" filled="f" stroked="f">
                 <v:textbox>
                   <w:txbxContent>
                     <w:p>
                       <w:pPr>
                         <w:pStyle w:val="Contedodoquadro"/>
-                        <w:spacing w:lineRule="auto" w:line="240" w:before="0" w:after="160"/>
+                        <w:spacing w:line="240" w:lineRule="auto"/>
                         <w:jc w:val="center"/>
                         <w:rPr>
                           <w:b/>
@@ -2216,12 +2414,27 @@
                           <w:b/>
                           <w:bCs/>
                         </w:rPr>
-                        <w:t>Equipe com +10 certificações técnicas (NRs)</w:t>
+                        <w:t>Equipe com +10 certificações técnicas (</w:t>
+                      </w:r>
+                      <w:proofErr w:type="spellStart"/>
+                      <w:r>
+                        <w:rPr>
+                          <w:b/>
+                          <w:bCs/>
+                        </w:rPr>
+                        <w:t>NRs</w:t>
+                      </w:r>
+                      <w:proofErr w:type="spellEnd"/>
+                      <w:r>
+                        <w:rPr>
+                          <w:b/>
+                          <w:bCs/>
+                        </w:rPr>
+                        <w:t>)</w:t>
                       </w:r>
                     </w:p>
                   </w:txbxContent>
                 </v:textbox>
-                <w10:wrap type="none"/>
               </v:rect>
             </w:pict>
           </mc:Fallback>
@@ -2307,17 +2520,15 @@
               </wp:anchor>
             </w:drawing>
           </mc:Choice>
-          <mc:Fallback xmlns:pic="http://schemas.openxmlformats.org/drawingml/2006/picture">
+          <mc:Fallback>
             <w:pict>
-              <v:rect id="shape_0" stroked="f" o:allowincell="f" style="position:absolute;margin-left:409.65pt;margin-top:87.95pt;width:102.55pt;height:54.55pt;mso-wrap-style:square;v-text-anchor:top" wp14:anchorId="0844202B">
-                <v:fill o:detectmouseclick="t" on="false"/>
-                <v:stroke color="#3465a4" weight="9360" joinstyle="miter" endcap="flat"/>
+              <v:rect w14:anchorId="0844202B" id="_x0000_s1030" style="position:absolute;left:0;text-align:left;margin-left:409.65pt;margin-top:87.95pt;width:102.6pt;height:54.6pt;z-index:-503316452;visibility:visible;mso-wrap-style:square;mso-wrap-distance-left:0;mso-wrap-distance-top:0;mso-wrap-distance-right:0;mso-wrap-distance-bottom:0;mso-position-horizontal:absolute;mso-position-horizontal-relative:text;mso-position-vertical:absolute;mso-position-vertical-relative:text;v-text-anchor:top" o:gfxdata="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" filled="f" stroked="f">
                 <v:textbox>
                   <w:txbxContent>
                     <w:p>
                       <w:pPr>
                         <w:pStyle w:val="Contedodoquadro"/>
-                        <w:spacing w:lineRule="auto" w:line="240" w:before="0" w:after="160"/>
+                        <w:spacing w:line="240" w:lineRule="auto"/>
                         <w:jc w:val="center"/>
                         <w:rPr>
                           <w:b/>
@@ -2334,7 +2545,6 @@
                     </w:p>
                   </w:txbxContent>
                 </v:textbox>
-                <w10:wrap type="none"/>
               </v:rect>
             </w:pict>
           </mc:Fallback>
@@ -2365,6 +2575,7 @@
         <w:rPr>
           <w:noProof/>
         </w:rPr>
+        <w:lastRenderedPageBreak/>
         <mc:AlternateContent>
           <mc:Choice Requires="wps">
             <w:drawing>
@@ -2441,17 +2652,15 @@
               </wp:anchor>
             </w:drawing>
           </mc:Choice>
-          <mc:Fallback xmlns:pic="http://schemas.openxmlformats.org/drawingml/2006/picture">
+          <mc:Fallback>
             <w:pict>
-              <v:rect id="shape_0" stroked="f" o:allowincell="f" style="position:absolute;margin-left:29.85pt;margin-top:76.45pt;width:76.75pt;height:34.75pt;mso-wrap-style:square;v-text-anchor:top" wp14:anchorId="338136DB">
-                <v:fill o:detectmouseclick="t" on="false"/>
-                <v:stroke color="#3465a4" weight="9360" joinstyle="miter" endcap="flat"/>
+              <v:rect w14:anchorId="338136DB" id="_x0000_s1031" style="position:absolute;left:0;text-align:left;margin-left:29.85pt;margin-top:76.45pt;width:76.8pt;height:34.8pt;z-index:-503316460;visibility:visible;mso-wrap-style:square;mso-wrap-distance-left:0;mso-wrap-distance-top:0;mso-wrap-distance-right:0;mso-wrap-distance-bottom:0;mso-position-horizontal:absolute;mso-position-horizontal-relative:text;mso-position-vertical:absolute;mso-position-vertical-relative:text;v-text-anchor:top" o:gfxdata="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" filled="f" stroked="f">
                 <v:textbox>
                   <w:txbxContent>
                     <w:p>
                       <w:pPr>
                         <w:pStyle w:val="Contedodoquadro"/>
-                        <w:spacing w:lineRule="auto" w:line="240" w:before="0" w:after="160"/>
+                        <w:spacing w:line="240" w:lineRule="auto"/>
                         <w:jc w:val="center"/>
                         <w:rPr>
                           <w:b/>
@@ -2468,7 +2677,6 @@
                     </w:p>
                   </w:txbxContent>
                 </v:textbox>
-                <w10:wrap type="none"/>
               </v:rect>
             </w:pict>
           </mc:Fallback>
@@ -2496,7 +2704,7 @@
                     </pic:cNvPicPr>
                   </pic:nvPicPr>
                   <pic:blipFill>
-                    <a:blip r:embed="rId13"/>
+                    <a:blip r:embed="rId17"/>
                     <a:srcRect l="17614" t="18806" r="16770" b="47080"/>
                     <a:stretch>
                       <a:fillRect/>
@@ -3006,7 +3214,7 @@
                           </pic:cNvPicPr>
                         </pic:nvPicPr>
                         <pic:blipFill>
-                          <a:blip r:embed="rId14"/>
+                          <a:blip r:embed="rId18"/>
                           <a:srcRect t="5458" r="1171"/>
                           <a:stretch>
                             <a:fillRect/>
@@ -3075,7 +3283,7 @@
                           </pic:cNvPicPr>
                         </pic:nvPicPr>
                         <pic:blipFill>
-                          <a:blip r:embed="rId15"/>
+                          <a:blip r:embed="rId19"/>
                           <a:stretch>
                             <a:fillRect/>
                           </a:stretch>
@@ -3143,7 +3351,7 @@
                           </pic:cNvPicPr>
                         </pic:nvPicPr>
                         <pic:blipFill>
-                          <a:blip r:embed="rId16"/>
+                          <a:blip r:embed="rId20"/>
                           <a:stretch>
                             <a:fillRect/>
                           </a:stretch>
@@ -3211,7 +3419,7 @@
                           </pic:cNvPicPr>
                         </pic:nvPicPr>
                         <pic:blipFill>
-                          <a:blip r:embed="rId17"/>
+                          <a:blip r:embed="rId21"/>
                           <a:stretch>
                             <a:fillRect/>
                           </a:stretch>
@@ -3328,7 +3536,7 @@
                           </pic:cNvPicPr>
                         </pic:nvPicPr>
                         <pic:blipFill>
-                          <a:blip r:embed="rId18"/>
+                          <a:blip r:embed="rId22"/>
                           <a:stretch>
                             <a:fillRect/>
                           </a:stretch>
@@ -3394,7 +3602,7 @@
                           </pic:cNvPicPr>
                         </pic:nvPicPr>
                         <pic:blipFill>
-                          <a:blip r:embed="rId19"/>
+                          <a:blip r:embed="rId23"/>
                           <a:stretch>
                             <a:fillRect/>
                           </a:stretch>
@@ -3461,7 +3669,7 @@
                           </pic:cNvPicPr>
                         </pic:nvPicPr>
                         <pic:blipFill>
-                          <a:blip r:embed="rId20"/>
+                          <a:blip r:embed="rId24"/>
                           <a:stretch>
                             <a:fillRect/>
                           </a:stretch>
@@ -3528,7 +3736,7 @@
                           </pic:cNvPicPr>
                         </pic:nvPicPr>
                         <pic:blipFill>
-                          <a:blip r:embed="rId21"/>
+                          <a:blip r:embed="rId25"/>
                           <a:stretch>
                             <a:fillRect/>
                           </a:stretch>
@@ -3631,7 +3839,7 @@
                     </pic:cNvPicPr>
                   </pic:nvPicPr>
                   <pic:blipFill>
-                    <a:blip r:embed="rId22"/>
+                    <a:blip r:embed="rId26"/>
                     <a:srcRect r="812"/>
                     <a:stretch>
                       <a:fillRect/>
@@ -3721,25 +3929,7 @@
           <w:sz w:val="20"/>
           <w:szCs w:val="20"/>
         </w:rPr>
-        <w:t xml:space="preserve">{{servico}}</w:t>
-      </w:r>
-      <w:proofErr w:type="spellStart"/>
-      <w:r>
-        <w:rPr>
-          <w:rFonts w:ascii="Arial" w:hAnsi="Arial" w:cs="Arial"/>
-          <w:sz w:val="20"/>
-          <w:szCs w:val="20"/>
-        </w:rPr>
-        <w:t/>
-      </w:r>
-      <w:proofErr w:type="spellEnd"/>
-      <w:r>
-        <w:rPr>
-          <w:rFonts w:ascii="Arial" w:hAnsi="Arial" w:cs="Arial"/>
-          <w:sz w:val="20"/>
-          <w:szCs w:val="20"/>
-        </w:rPr>
-        <w:t/>
+        <w:t>{{servico}}</w:t>
       </w:r>
     </w:p>
     <w:p>
@@ -4110,33 +4300,7 @@
                 <w:szCs w:val="16"/>
                 <w:lang w:eastAsia="pt-BR"/>
               </w:rPr>
-              <w:t xml:space="preserve">{{categoria_filtrovali}}</w:t>
-            </w:r>
-            <w:proofErr w:type="spellStart"/>
-            <w:r>
-              <w:rPr>
-                <w:rFonts w:ascii="Arial" w:eastAsia="Arial" w:hAnsi="Arial" w:cs="Arial"/>
-                <w:b/>
-                <w:bCs/>
-                <w:color w:val="000000"/>
-                <w:sz w:val="16"/>
-                <w:szCs w:val="16"/>
-                <w:lang w:eastAsia="pt-BR"/>
-              </w:rPr>
-              <w:t/>
-            </w:r>
-            <w:proofErr w:type="spellEnd"/>
-            <w:r>
-              <w:rPr>
-                <w:rFonts w:ascii="Arial" w:eastAsia="Arial" w:hAnsi="Arial" w:cs="Arial"/>
-                <w:b/>
-                <w:bCs/>
-                <w:color w:val="000000"/>
-                <w:sz w:val="16"/>
-                <w:szCs w:val="16"/>
-                <w:lang w:eastAsia="pt-BR"/>
-              </w:rPr>
-              <w:t/>
+              <w:t>{{categoria_filtrovali}}</w:t>
             </w:r>
           </w:p>
         </w:tc>
@@ -4205,29 +4369,7 @@
                 <w:szCs w:val="16"/>
                 <w:lang w:eastAsia="pt-BR"/>
               </w:rPr>
-              <w:t xml:space="preserve">{{escopo_filtrovali}}</w:t>
-            </w:r>
-            <w:proofErr w:type="spellStart"/>
-            <w:r>
-              <w:rPr>
-                <w:rFonts w:ascii="Arial" w:eastAsia="Arial" w:hAnsi="Arial" w:cs="Arial"/>
-                <w:color w:val="000000"/>
-                <w:sz w:val="16"/>
-                <w:szCs w:val="16"/>
-                <w:lang w:eastAsia="pt-BR"/>
-              </w:rPr>
-              <w:t/>
-            </w:r>
-            <w:proofErr w:type="spellEnd"/>
-            <w:r>
-              <w:rPr>
-                <w:rFonts w:ascii="Arial" w:eastAsia="Arial" w:hAnsi="Arial" w:cs="Arial"/>
-                <w:color w:val="000000"/>
-                <w:sz w:val="16"/>
-                <w:szCs w:val="16"/>
-                <w:lang w:eastAsia="pt-BR"/>
-              </w:rPr>
-              <w:t/>
+              <w:t>{{escopo_filtrovali}}</w:t>
             </w:r>
           </w:p>
         </w:tc>
@@ -4262,29 +4404,7 @@
                 <w:szCs w:val="16"/>
                 <w:lang w:eastAsia="pt-BR"/>
               </w:rPr>
-              <w:t xml:space="preserve">{{nota_filtrovali}}</w:t>
-            </w:r>
-            <w:proofErr w:type="spellStart"/>
-            <w:r>
-              <w:rPr>
-                <w:rFonts w:ascii="Arial" w:eastAsia="Arial" w:hAnsi="Arial" w:cs="Arial"/>
-                <w:color w:val="000000"/>
-                <w:sz w:val="16"/>
-                <w:szCs w:val="16"/>
-                <w:lang w:eastAsia="pt-BR"/>
-              </w:rPr>
-              <w:t/>
-            </w:r>
-            <w:proofErr w:type="spellEnd"/>
-            <w:r>
-              <w:rPr>
-                <w:rFonts w:ascii="Arial" w:eastAsia="Arial" w:hAnsi="Arial" w:cs="Arial"/>
-                <w:color w:val="000000"/>
-                <w:sz w:val="16"/>
-                <w:szCs w:val="16"/>
-                <w:lang w:eastAsia="pt-BR"/>
-              </w:rPr>
-              <w:t/>
+              <w:t>{{nota_filtrovali}}</w:t>
             </w:r>
           </w:p>
         </w:tc>
@@ -4516,31 +4636,7 @@
                 <w:szCs w:val="16"/>
                 <w:lang w:eastAsia="pt-BR"/>
               </w:rPr>
-              <w:t xml:space="preserve">{{categoria_contratante}}</w:t>
-            </w:r>
-            <w:proofErr w:type="spellStart"/>
-            <w:r>
-              <w:rPr>
-                <w:rFonts w:ascii="Arial" w:eastAsia="Arial" w:hAnsi="Arial" w:cs="Arial"/>
-                <w:b/>
-                <w:color w:val="000000"/>
-                <w:sz w:val="16"/>
-                <w:szCs w:val="16"/>
-                <w:lang w:eastAsia="pt-BR"/>
-              </w:rPr>
-              <w:t/>
-            </w:r>
-            <w:proofErr w:type="spellEnd"/>
-            <w:r>
-              <w:rPr>
-                <w:rFonts w:ascii="Arial" w:eastAsia="Arial" w:hAnsi="Arial" w:cs="Arial"/>
-                <w:b/>
-                <w:color w:val="000000"/>
-                <w:sz w:val="16"/>
-                <w:szCs w:val="16"/>
-                <w:lang w:eastAsia="pt-BR"/>
-              </w:rPr>
-              <w:t/>
+              <w:t>{{categoria_contratante}}</w:t>
             </w:r>
           </w:p>
         </w:tc>
@@ -4607,27 +4703,7 @@
                 <w:szCs w:val="16"/>
                 <w:lang w:eastAsia="pt-BR"/>
               </w:rPr>
-              <w:t xml:space="preserve">{{escopo_contratante}}</w:t>
-            </w:r>
-            <w:proofErr w:type="spellStart"/>
-            <w:r>
-              <w:rPr>
-                <w:rFonts w:ascii="Arial" w:hAnsi="Arial" w:cs="Arial"/>
-                <w:sz w:val="16"/>
-                <w:szCs w:val="16"/>
-                <w:lang w:eastAsia="pt-BR"/>
-              </w:rPr>
-              <w:t/>
-            </w:r>
-            <w:proofErr w:type="spellEnd"/>
-            <w:r>
-              <w:rPr>
-                <w:rFonts w:ascii="Arial" w:hAnsi="Arial" w:cs="Arial"/>
-                <w:sz w:val="16"/>
-                <w:szCs w:val="16"/>
-                <w:lang w:eastAsia="pt-BR"/>
-              </w:rPr>
-              <w:t/>
+              <w:t>{{escopo_contratante}}</w:t>
             </w:r>
           </w:p>
         </w:tc>
@@ -4662,29 +4738,7 @@
                 <w:szCs w:val="16"/>
                 <w:lang w:eastAsia="pt-BR"/>
               </w:rPr>
-              <w:t xml:space="preserve">{{nota_contratante}}</w:t>
-            </w:r>
-            <w:proofErr w:type="spellStart"/>
-            <w:r>
-              <w:rPr>
-                <w:rFonts w:ascii="Arial" w:eastAsia="Arial" w:hAnsi="Arial" w:cs="Arial"/>
-                <w:color w:val="000000"/>
-                <w:sz w:val="16"/>
-                <w:szCs w:val="16"/>
-                <w:lang w:eastAsia="pt-BR"/>
-              </w:rPr>
-              <w:t/>
-            </w:r>
-            <w:proofErr w:type="spellEnd"/>
-            <w:r>
-              <w:rPr>
-                <w:rFonts w:ascii="Arial" w:eastAsia="Arial" w:hAnsi="Arial" w:cs="Arial"/>
-                <w:color w:val="000000"/>
-                <w:sz w:val="16"/>
-                <w:szCs w:val="16"/>
-                <w:lang w:eastAsia="pt-BR"/>
-              </w:rPr>
-              <w:t/>
+              <w:t>{{nota_contratante}}</w:t>
             </w:r>
             <w:bookmarkStart w:id="2" w:name="_Hlk211261915"/>
             <w:bookmarkEnd w:id="2"/>
@@ -4705,6 +4759,17 @@
     </w:p>
     <w:p>
       <w:pPr>
+        <w:spacing w:after="0" w:line="240" w:lineRule="auto"/>
+        <w:jc w:val="both"/>
+        <w:rPr>
+          <w:rFonts w:ascii="Arial" w:eastAsia="Arial" w:hAnsi="Arial"/>
+          <w:sz w:val="20"/>
+          <w:szCs w:val="20"/>
+        </w:rPr>
+      </w:pPr>
+    </w:p>
+    <w:p>
+      <w:pPr>
         <w:pStyle w:val="PargrafodaLista"/>
         <w:numPr>
           <w:ilvl w:val="0"/>
@@ -4815,7 +4880,6 @@
           <w:sz w:val="20"/>
           <w:szCs w:val="20"/>
         </w:rPr>
-        <w:lastRenderedPageBreak/>
         <w:t>Nos casos em que o contrato for firmado entre a Filtrovali e a montadora, porém o faturamento ocorrer diretamente para o Cliente Final, a mobilização ficará condicionada à emissão do pedido de compra pelo Cliente Final;</w:t>
       </w:r>
     </w:p>
@@ -5333,72 +5397,6 @@
         </w:rPr>
         <w:t xml:space="preserve">Notas: Os trabalhos em horas extras (sábados, domingos, feriados e além do previsto no item 6.1) poderão ser executados quando solicitado pela Contratante. Será feito o registro em RDO, indicado no campo Horas Extras e lançado na medição como adicional. </w:t>
       </w:r>
-    </w:p>
-    <w:p>
-      <w:pPr>
-        <w:spacing w:after="0" w:line="240" w:lineRule="auto"/>
-        <w:jc w:val="both"/>
-        <w:rPr>
-          <w:rFonts w:ascii="Arial" w:eastAsia="Arial" w:hAnsi="Arial"/>
-          <w:sz w:val="20"/>
-          <w:szCs w:val="20"/>
-        </w:rPr>
-      </w:pPr>
-    </w:p>
-    <w:p>
-      <w:pPr>
-        <w:spacing w:after="0" w:line="240" w:lineRule="auto"/>
-        <w:rPr>
-          <w:rFonts w:ascii="Arial" w:hAnsi="Arial" w:cs="Arial"/>
-          <w:b/>
-          <w:sz w:val="20"/>
-          <w:szCs w:val="20"/>
-        </w:rPr>
-      </w:pPr>
-    </w:p>
-    <w:p>
-      <w:pPr>
-        <w:spacing w:after="0" w:line="240" w:lineRule="auto"/>
-        <w:rPr>
-          <w:rFonts w:ascii="Arial" w:hAnsi="Arial" w:cs="Arial"/>
-          <w:b/>
-          <w:sz w:val="20"/>
-          <w:szCs w:val="20"/>
-        </w:rPr>
-      </w:pPr>
-    </w:p>
-    <w:p>
-      <w:pPr>
-        <w:spacing w:after="0" w:line="240" w:lineRule="auto"/>
-        <w:rPr>
-          <w:rFonts w:ascii="Arial" w:hAnsi="Arial" w:cs="Arial"/>
-          <w:b/>
-          <w:sz w:val="20"/>
-          <w:szCs w:val="20"/>
-        </w:rPr>
-      </w:pPr>
-    </w:p>
-    <w:p>
-      <w:pPr>
-        <w:spacing w:after="0" w:line="240" w:lineRule="auto"/>
-        <w:rPr>
-          <w:rFonts w:ascii="Arial" w:hAnsi="Arial" w:cs="Arial"/>
-          <w:b/>
-          <w:sz w:val="20"/>
-          <w:szCs w:val="20"/>
-        </w:rPr>
-      </w:pPr>
-    </w:p>
-    <w:p>
-      <w:pPr>
-        <w:spacing w:after="0" w:line="240" w:lineRule="auto"/>
-        <w:rPr>
-          <w:rFonts w:ascii="Arial" w:hAnsi="Arial" w:cs="Arial"/>
-          <w:b/>
-          <w:sz w:val="20"/>
-          <w:szCs w:val="20"/>
-        </w:rPr>
-      </w:pPr>
     </w:p>
     <w:p>
       <w:pPr>
@@ -5637,25 +5635,7 @@
                 <w:sz w:val="20"/>
                 <w:szCs w:val="20"/>
               </w:rPr>
-              <w:t xml:space="preserve">{{descricao_a}}</w:t>
-            </w:r>
-            <w:proofErr w:type="spellStart"/>
-            <w:r>
-              <w:rPr>
-                <w:rFonts w:ascii="Arial" w:eastAsia="Arial" w:hAnsi="Arial"/>
-                <w:sz w:val="20"/>
-                <w:szCs w:val="20"/>
-              </w:rPr>
-              <w:t/>
-            </w:r>
-            <w:proofErr w:type="spellEnd"/>
-            <w:r>
-              <w:rPr>
-                <w:rFonts w:ascii="Arial" w:eastAsia="Arial" w:hAnsi="Arial"/>
-                <w:sz w:val="20"/>
-                <w:szCs w:val="20"/>
-              </w:rPr>
-              <w:t/>
+              <w:t>{{descricao_a}}</w:t>
             </w:r>
           </w:p>
         </w:tc>
@@ -5679,25 +5659,7 @@
                 <w:sz w:val="20"/>
                 <w:szCs w:val="20"/>
               </w:rPr>
-              <w:t xml:space="preserve">{{unitario_a}}</w:t>
-            </w:r>
-            <w:proofErr w:type="spellStart"/>
-            <w:r>
-              <w:rPr>
-                <w:rFonts w:ascii="Arial" w:eastAsia="Arial" w:hAnsi="Arial"/>
-                <w:sz w:val="20"/>
-                <w:szCs w:val="20"/>
-              </w:rPr>
-              <w:t/>
-            </w:r>
-            <w:proofErr w:type="spellEnd"/>
-            <w:r>
-              <w:rPr>
-                <w:rFonts w:ascii="Arial" w:eastAsia="Arial" w:hAnsi="Arial"/>
-                <w:sz w:val="20"/>
-                <w:szCs w:val="20"/>
-              </w:rPr>
-              <w:t/>
+              <w:t>{{unitario_a}}</w:t>
             </w:r>
           </w:p>
         </w:tc>
@@ -5721,25 +5683,16 @@
                 <w:sz w:val="20"/>
                 <w:szCs w:val="20"/>
               </w:rPr>
-              <w:t xml:space="preserve">{{quantidade_a}}</w:t>
+              <w:t>{{quantidade</w:t>
             </w:r>
-            <w:proofErr w:type="spellStart"/>
             <w:r>
               <w:rPr>
                 <w:rFonts w:ascii="Arial" w:eastAsia="Arial" w:hAnsi="Arial"/>
                 <w:sz w:val="20"/>
                 <w:szCs w:val="20"/>
               </w:rPr>
-              <w:t/>
-            </w:r>
-            <w:proofErr w:type="spellEnd"/>
-            <w:r>
-              <w:rPr>
-                <w:rFonts w:ascii="Arial" w:eastAsia="Arial" w:hAnsi="Arial"/>
-                <w:sz w:val="20"/>
-                <w:szCs w:val="20"/>
-              </w:rPr>
-              <w:t/>
+              <w:lastRenderedPageBreak/>
+              <w:t>_a}}</w:t>
             </w:r>
           </w:p>
         </w:tc>
@@ -5763,25 +5716,8 @@
                 <w:sz w:val="20"/>
                 <w:szCs w:val="20"/>
               </w:rPr>
-              <w:t xml:space="preserve">{{valor_a}}</w:t>
-            </w:r>
-            <w:proofErr w:type="spellStart"/>
-            <w:r>
-              <w:rPr>
-                <w:rFonts w:ascii="Arial" w:eastAsia="Arial" w:hAnsi="Arial"/>
-                <w:sz w:val="20"/>
-                <w:szCs w:val="20"/>
-              </w:rPr>
-              <w:t/>
-            </w:r>
-            <w:proofErr w:type="spellEnd"/>
-            <w:r>
-              <w:rPr>
-                <w:rFonts w:ascii="Arial" w:eastAsia="Arial" w:hAnsi="Arial"/>
-                <w:sz w:val="20"/>
-                <w:szCs w:val="20"/>
-              </w:rPr>
-              <w:t/>
+              <w:lastRenderedPageBreak/>
+              <w:t>{{valor_a}}</w:t>
             </w:r>
           </w:p>
         </w:tc>
@@ -5842,29 +5778,7 @@
                 <w:sz w:val="20"/>
                 <w:szCs w:val="20"/>
               </w:rPr>
-              <w:t xml:space="preserve">{{total_a}}</w:t>
-            </w:r>
-            <w:proofErr w:type="spellStart"/>
-            <w:r>
-              <w:rPr>
-                <w:rFonts w:ascii="Arial" w:eastAsia="Arial" w:hAnsi="Arial"/>
-                <w:b/>
-                <w:bCs/>
-                <w:sz w:val="20"/>
-                <w:szCs w:val="20"/>
-              </w:rPr>
-              <w:t/>
-            </w:r>
-            <w:proofErr w:type="spellEnd"/>
-            <w:r>
-              <w:rPr>
-                <w:rFonts w:ascii="Arial" w:eastAsia="Arial" w:hAnsi="Arial"/>
-                <w:b/>
-                <w:bCs/>
-                <w:sz w:val="20"/>
-                <w:szCs w:val="20"/>
-              </w:rPr>
-              <w:t/>
+              <w:t>{{total_a}}</w:t>
             </w:r>
           </w:p>
         </w:tc>
@@ -6065,7 +5979,6 @@
         <w:t>adto</w:t>
       </w:r>
       <w:proofErr w:type="spellEnd"/>
-      <w:proofErr w:type="gramStart"/>
       <w:r>
         <w:rPr>
           <w:rFonts w:ascii="Arial" w:eastAsia="Arial" w:hAnsi="Arial"/>
@@ -6076,7 +5989,6 @@
         </w:rPr>
         <w:t>}}%</w:t>
       </w:r>
-      <w:proofErr w:type="gramEnd"/>
       <w:r>
         <w:rPr>
           <w:rFonts w:ascii="Arial" w:eastAsia="Arial" w:hAnsi="Arial"/>
@@ -6528,7 +6440,6 @@
                 <w:sz w:val="20"/>
                 <w:szCs w:val="20"/>
               </w:rPr>
-              <w:lastRenderedPageBreak/>
               <w:t>Item</w:t>
             </w:r>
           </w:p>
@@ -6735,6 +6646,7 @@
                 <w:sz w:val="20"/>
                 <w:szCs w:val="20"/>
               </w:rPr>
+              <w:lastRenderedPageBreak/>
               <w:t xml:space="preserve">Mobilização Extra (por evento ida e volta) </w:t>
             </w:r>
           </w:p>
@@ -6759,16 +6671,7 @@
                 <w:sz w:val="20"/>
                 <w:szCs w:val="20"/>
               </w:rPr>
-              <w:t>R</w:t>
-            </w:r>
-            <w:proofErr w:type="gramStart"/>
-            <w:r>
-              <w:rPr>
-                <w:rFonts w:ascii="Arial" w:eastAsia="Arial" w:hAnsi="Arial"/>
-                <w:sz w:val="20"/>
-                <w:szCs w:val="20"/>
-              </w:rPr>
-              <w:t xml:space="preserve">$  </w:t>
+              <w:t xml:space="preserve">R$  </w:t>
             </w:r>
             <w:r>
               <w:rPr>
@@ -6777,17 +6680,7 @@
                 <w:szCs w:val="20"/>
                 <w:lang w:val="en-US"/>
               </w:rPr>
-              <w:t>{</w:t>
-            </w:r>
-            <w:proofErr w:type="gramEnd"/>
-            <w:r>
-              <w:rPr>
-                <w:rFonts w:ascii="Arial" w:eastAsia="Arial" w:hAnsi="Arial"/>
-                <w:sz w:val="20"/>
-                <w:szCs w:val="20"/>
-                <w:lang w:val="en-US"/>
-              </w:rPr>
-              <w:t>{</w:t>
+              <w:t>{{</w:t>
             </w:r>
             <w:proofErr w:type="spellStart"/>
             <w:r>
@@ -7994,25 +7887,14 @@
           <w:szCs w:val="20"/>
         </w:rPr>
       </w:pPr>
-      <w:proofErr w:type="gramStart"/>
-      <w:r>
-        <w:rPr>
-          <w:rFonts w:ascii="Arial" w:hAnsi="Arial" w:cs="Arial"/>
-          <w:bCs/>
-          <w:sz w:val="20"/>
-          <w:szCs w:val="20"/>
-        </w:rPr>
-        <w:t>[    ]</w:t>
-      </w:r>
-      <w:proofErr w:type="gramEnd"/>
-      <w:r>
-        <w:rPr>
-          <w:rFonts w:ascii="Arial" w:hAnsi="Arial" w:cs="Arial"/>
-          <w:bCs/>
-          <w:sz w:val="20"/>
-          <w:szCs w:val="20"/>
-        </w:rPr>
-        <w:t xml:space="preserve"> Declaro ter lido, compreendido e aceitado integralmente os termos e condições apresentados na presente proposta.</w:t>
+      <w:r>
+        <w:rPr>
+          <w:rFonts w:ascii="Arial" w:hAnsi="Arial" w:cs="Arial"/>
+          <w:bCs/>
+          <w:sz w:val="20"/>
+          <w:szCs w:val="20"/>
+        </w:rPr>
+        <w:t>[    ] Declaro ter lido, compreendido e aceitado integralmente os termos e condições apresentados na presente proposta.</w:t>
       </w:r>
     </w:p>
     <w:p>
@@ -8183,10 +8065,7 @@
       </w:pPr>
     </w:p>
     <w:sectPr>
-      <w:headerReference w:type="default" r:id="rId23"/>
-      <w:footerReference w:type="default" r:id="rId24"/>
-      <w:headerReference w:type="first" r:id="rId25"/>
-      <w:footerReference w:type="first" r:id="rId26"/>
+      <w:type w:val="continuous"/>
       <w:pgSz w:w="11906" w:h="16838"/>
       <w:pgMar w:top="2977" w:right="566" w:bottom="1417" w:left="567" w:header="737" w:footer="132" w:gutter="0"/>
       <w:cols w:space="720"/>
@@ -8367,6 +8246,8 @@
 <w:hdr xmlns:wpc="http://schemas.microsoft.com/office/word/2010/wordprocessingCanvas" xmlns:cx="http://schemas.microsoft.com/office/drawing/2014/chartex" xmlns:cx1="http://schemas.microsoft.com/office/drawing/2015/9/8/chartex" xmlns:cx2="http://schemas.microsoft.com/office/drawing/2015/10/21/chartex" xmlns:cx3="http://schemas.microsoft.com/office/drawing/2016/5/9/chartex" xmlns:cx4="http://schemas.microsoft.com/office/drawing/2016/5/10/chartex" xmlns:cx5="http://schemas.microsoft.com/office/drawing/2016/5/11/chartex" xmlns:cx6="http://schemas.microsoft.com/office/drawing/2016/5/12/chartex" xmlns:cx7="http://schemas.microsoft.com/office/drawing/2016/5/13/chartex" xmlns:cx8="http://schemas.microsoft.com/office/drawing/2016/5/14/chartex" xmlns:mc="http://schemas.openxmlformats.org/markup-compatibility/2006" xmlns:aink="http://schemas.microsoft.com/office/drawing/2016/ink" xmlns:am3d="http://schemas.microsoft.com/office/drawing/2017/model3d" xmlns:o="urn:schemas-microsoft-com:office:office" xmlns:oel="http://schemas.microsoft.com/office/2019/extlst" xmlns:r="http://schemas.openxmlformats.org/officeDocument/2006/relationships" xmlns:m="http://schemas.openxmlformats.org/officeDocument/2006/math" xmlns:v="urn:schemas-microsoft-com:vml" xmlns:wp14="http://schemas.microsoft.com/office/word/2010/wordprocessingDrawing" xmlns:wp="http://schemas.openxmlformats.org/drawingml/2006/wordprocessingDrawing" xmlns:w10="urn:schemas-microsoft-com:office:word" xmlns:w="http://schemas.openxmlformats.org/wordprocessingml/2006/main" xmlns:w14="http://schemas.microsoft.com/office/word/2010/wordml" xmlns:w15="http://schemas.microsoft.com/office/word/2012/wordml" xmlns:w16cex="http://schemas.microsoft.com/office/word/2018/wordml/cex" xmlns:w16cid="http://schemas.microsoft.com/office/word/2016/wordml/cid" xmlns:w16="http://schemas.microsoft.com/office/word/2018/wordml" xmlns:w16du="http://schemas.microsoft.com/office/word/2023/wordml/word16du" xmlns:w16sdtdh="http://schemas.microsoft.com/office/word/2020/wordml/sdtdatahash" xmlns:w16sdtfl="http://schemas.microsoft.com/office/word/2024/wordml/sdtformatlock" xmlns:w16se="http://schemas.microsoft.com/office/word/2015/wordml/symex" xmlns:wpg="http://schemas.microsoft.com/office/word/2010/wordprocessingGroup" xmlns:wpi="http://schemas.microsoft.com/office/word/2010/wordprocessingInk" xmlns:wne="http://schemas.microsoft.com/office/word/2006/wordml" xmlns:wps="http://schemas.microsoft.com/office/word/2010/wordprocessingShape" mc:Ignorable="w14 w15 w16se w16cid w16 w16cex w16sdtdh w16sdtfl w16du wp14">
   <w:p>
     <w:pPr>
+      <w:ind w:left="2124" w:right="850"/>
+      <w:jc w:val="right"/>
       <w:rPr>
         <w:rFonts w:ascii="Arial" w:hAnsi="Arial" w:cs="Arial"/>
         <w:b/>
@@ -10058,7 +9939,7 @@
   <w:style w:type="paragraph" w:default="1" w:styleId="Normal">
     <w:name w:val="Normal"/>
     <w:qFormat/>
-    <w:rsid w:val="00E54E6A"/>
+    <w:rsid w:val="00A218CB"/>
     <w:pPr>
       <w:spacing w:after="160" w:line="259" w:lineRule="auto"/>
     </w:pPr>
@@ -10471,7 +10352,12 @@
 </file>
 
 <file path=customXml/item2.xml><?xml version="1.0" encoding="utf-8"?>
-<b:Sources xmlns:b="http://schemas.openxmlformats.org/officeDocument/2006/bibliography" xmlns="http://schemas.openxmlformats.org/officeDocument/2006/bibliography" SelectedStyle="\APASixthEditionOfficeOnline.xsl" StyleName="APA" Version="6"/>
+<?mso-contentType ?>
+<FormTemplates xmlns="http://schemas.microsoft.com/sharepoint/v3/contenttype/forms">
+  <Display>DocumentLibraryForm</Display>
+  <Edit>DocumentLibraryForm</Edit>
+  <New>DocumentLibraryForm</New>
+</FormTemplates>
 </file>
 
 <file path=customXml/item3.xml><?xml version="1.0" encoding="utf-8"?>
@@ -10684,12 +10570,7 @@
 </file>
 
 <file path=customXml/item4.xml><?xml version="1.0" encoding="utf-8"?>
-<?mso-contentType ?>
-<FormTemplates xmlns="http://schemas.microsoft.com/sharepoint/v3/contenttype/forms">
-  <Display>DocumentLibraryForm</Display>
-  <Edit>DocumentLibraryForm</Edit>
-  <New>DocumentLibraryForm</New>
-</FormTemplates>
+<b:Sources xmlns:b="http://schemas.openxmlformats.org/officeDocument/2006/bibliography" xmlns="http://schemas.openxmlformats.org/officeDocument/2006/bibliography" SelectedStyle="\APASixthEditionOfficeOnline.xsl" StyleName="APA" Version="6"/>
 </file>
 
 <file path=customXml/itemProps1.xml><?xml version="1.0" encoding="utf-8"?>
@@ -10704,9 +10585,9 @@
 </file>
 
 <file path=customXml/itemProps2.xml><?xml version="1.0" encoding="utf-8"?>
-<ds:datastoreItem xmlns:ds="http://schemas.openxmlformats.org/officeDocument/2006/customXml" ds:itemID="{AB0B6225-2C28-4B59-AC07-D3905D9EBCC2}">
+<ds:datastoreItem xmlns:ds="http://schemas.openxmlformats.org/officeDocument/2006/customXml" ds:itemID="{34A391BE-20F1-46BC-8252-C95237E583C0}">
   <ds:schemaRefs>
-    <ds:schemaRef ds:uri="http://schemas.openxmlformats.org/officeDocument/2006/bibliography"/>
+    <ds:schemaRef ds:uri="http://schemas.microsoft.com/sharepoint/v3/contenttype/forms"/>
   </ds:schemaRefs>
 </ds:datastoreItem>
 </file>
@@ -10731,9 +10612,9 @@
 </file>
 
 <file path=customXml/itemProps4.xml><?xml version="1.0" encoding="utf-8"?>
-<ds:datastoreItem xmlns:ds="http://schemas.openxmlformats.org/officeDocument/2006/customXml" ds:itemID="{34A391BE-20F1-46BC-8252-C95237E583C0}">
+<ds:datastoreItem xmlns:ds="http://schemas.openxmlformats.org/officeDocument/2006/customXml" ds:itemID="{AB0B6225-2C28-4B59-AC07-D3905D9EBCC2}">
   <ds:schemaRefs>
-    <ds:schemaRef ds:uri="http://schemas.microsoft.com/sharepoint/v3/contenttype/forms"/>
+    <ds:schemaRef ds:uri="http://schemas.openxmlformats.org/officeDocument/2006/bibliography"/>
   </ds:schemaRefs>
 </ds:datastoreItem>
 </file>
</xml_diff>